<commit_message>
docs: separate G1.1 card from G1.3 lifecycle
</commit_message>
<xml_diff>
--- a/reports/six-goals-functional-tz-2026-07-20/tz-g1-3-for-igor.docx
+++ b/reports/six-goals-functional-tz-2026-07-20/tz-g1-3-for-igor.docx
@@ -270,6 +270,17 @@
       </w:r>
     </w:p>
     <w:p>
+      <w:r>
+        <w:rPr>
+          <w:rFonts w:ascii="Calibri" w:hAnsi="Calibri"/>
+          <w:b w:val="0"/>
+          <w:color w:val="17202A"/>
+          <w:sz w:val="22"/>
+        </w:rPr>
+        <w:t>G1.3 не создает второй чат и не создает вторую карточку консультации.</w:t>
+      </w:r>
+    </w:p>
+    <w:p>
       <w:pPr>
         <w:keepNext/>
       </w:pPr>
@@ -280,7 +291,25 @@
           <w:color w:val="17202A"/>
           <w:sz w:val="22"/>
         </w:rPr>
-        <w:t>G1.3 не создает второй чат и не создает вторую карточку консультации.</w:t>
+        <w:t xml:space="preserve">G1.3 является </w:t>
+      </w:r>
+      <w:r>
+        <w:rPr>
+          <w:rFonts w:ascii="Calibri" w:hAnsi="Calibri"/>
+          <w:b/>
+          <w:color w:val="17202A"/>
+          <w:sz w:val="22"/>
+        </w:rPr>
+        <w:t>единственным источником истины</w:t>
+      </w:r>
+      <w:r>
+        <w:rPr>
+          <w:rFonts w:ascii="Calibri" w:hAnsi="Calibri"/>
+          <w:b w:val="0"/>
+          <w:color w:val="17202A"/>
+          <w:sz w:val="22"/>
+        </w:rPr>
+        <w:t xml:space="preserve"> для состояний, переходов, таймаутов, lifecycle-причин и правил возобновления/завершения consultation. G1.1 только отображает эти результаты в карточке и не повторяет их как собственные требования.</w:t>
       </w:r>
     </w:p>
     <w:p>
@@ -442,6 +471,17 @@
           <w:sz w:val="22"/>
         </w:rPr>
         <w:t>G5 владеет событиями, dashboard и KPI.</w:t>
+      </w:r>
+    </w:p>
+    <w:p>
+      <w:r>
+        <w:rPr>
+          <w:rFonts w:ascii="Calibri" w:hAnsi="Calibri"/>
+          <w:b w:val="0"/>
+          <w:color w:val="17202A"/>
+          <w:sz w:val="22"/>
+        </w:rPr>
+        <w:t>Если формулировка о состоянии, deadline, pause, reconnect или завершении встречается на поверхности G1.1, она является требованием к отображению факта G1.3, а не вторым правилом перехода.</w:t>
       </w:r>
     </w:p>
     <w:p>
@@ -7353,7 +7393,7 @@
           <w:color w:val="31445A"/>
           <w:sz w:val="19"/>
         </w:rPr>
-        <w:t>1.1</w:t>
+        <w:t>1.2</w:t>
       </w:r>
     </w:p>
     <w:p>
@@ -7514,7 +7554,7 @@
         <w:color w:val="5F6B7A"/>
         <w:sz w:val="18"/>
       </w:rPr>
-      <w:t xml:space="preserve">Статусы и история консультации  •  стр. </w:t>
+      <w:t xml:space="preserve">G1.3  •  стр. </w:t>
     </w:r>
     <w:r>
       <w:rPr>

</xml_diff>